<commit_message>
Fix page size: A4 instead of US Letter
sectPr regex was not matching because the krissen base template has
rsid attributes on <w:sectPr>. Changed to <w:sectPr\b to match any
attributes. Templates and examples regenerated at correct A4 size.

Co-Authored-By: Claude Sonnet 4.6 <noreply@anthropic.com>
</commit_message>
<xml_diff>
--- a/examples/example-academic.docx
+++ b/examples/example-academic.docx
@@ -819,9 +819,12 @@
     <w:bookmarkEnd w:id="24"/>
     <w:bookmarkEnd w:id="25"/>
     <w:sectPr>
-      <w:pgSz w:h="15840" w:w="12240"/>
-      <w:pgMar w:bottom="1417" w:footer="720" w:gutter="0" w:header="720" w:left="1417" w:right="1417" w:top="1417"/>
-      <w:cols w:space="720"/>
+      <w:footerReference r:id="rIdFooter1" w:type="default"/>
+      <w:pgSz w:h="16838" w:w="11906"/>
+      <w:pgMar w:bottom="1440" w:footer="709" w:gutter="0" w:header="709" w:left="1440" w:right="1440" w:top="1440"/>
+      <w:footnotePr>
+        <w:numRestart w:val="eachSect"/>
+      </w:footnotePr>
     </w:sectPr>
   </w:body>
 </w:document>

</xml_diff>

<commit_message>
Add Figure/Caption styles, reduce academic spacing to 1.5x
- Figure: centred paragraph for images
- Caption: 9pt italic centred (template font)
- ImageCaption, TableCaption: inherit from Caption
- Academic: 2.0x → 1.5x line spacing

Co-Authored-By: Claude Sonnet 4.6 <noreply@anthropic.com>
</commit_message>
<xml_diff>
--- a/examples/example-academic.docx
+++ b/examples/example-academic.docx
@@ -2989,7 +2989,7 @@
     <w:qFormat/>
     <w:pPr>
       <w:jc w:val="both"/>
-      <w:spacing w:after="0" w:line="480" w:lineRule="auto"/>
+      <w:spacing w:after="0" w:line="360" w:lineRule="auto"/>
     </w:pPr>
     <w:rPr>
       <w:rFonts w:ascii="Cambria" w:cs="Cambria" w:hAnsi="Cambria"/>
@@ -3232,11 +3232,21 @@
     <w:name w:val="Body Text"/>
     <w:basedOn w:val="Normal"/>
     <w:qFormat/>
+    <w:rPr>
+      <w:rFonts w:ascii="Cambria" w:cs="Cambria" w:hAnsi="Cambria"/>
+      <w:sz w:val="24"/>
+      <w:szCs w:val="24"/>
+    </w:rPr>
   </w:style>
   <w:style w:styleId="FirstParagraph" w:type="paragraph">
     <w:name w:val="First Paragraph"/>
     <w:basedOn w:val="Normal"/>
     <w:qFormat/>
+    <w:rPr>
+      <w:rFonts w:ascii="Cambria" w:cs="Cambria" w:hAnsi="Cambria"/>
+      <w:sz w:val="24"/>
+      <w:szCs w:val="24"/>
+    </w:rPr>
   </w:style>
   <w:style w:styleId="Compact" w:type="paragraph">
     <w:name w:val="Compact"/>
@@ -3244,8 +3254,13 @@
     <w:qFormat/>
     <w:pPr>
       <w:jc w:val="both"/>
-      <w:spacing w:after="0" w:line="480" w:lineRule="auto"/>
+      <w:spacing w:after="0" w:line="360" w:lineRule="auto"/>
     </w:pPr>
+    <w:rPr>
+      <w:rFonts w:ascii="Cambria" w:cs="Cambria" w:hAnsi="Cambria"/>
+      <w:sz w:val="24"/>
+      <w:szCs w:val="24"/>
+    </w:rPr>
   </w:style>
   <w:style w:styleId="Title" w:type="paragraph">
     <w:name w:val="Title"/>
@@ -3295,25 +3310,30 @@
   </w:style>
   <w:style w:styleId="Date" w:type="paragraph">
     <w:name w:val="Date"/>
-    <w:next w:val="BodyText"/>
+    <w:basedOn w:val="Normal"/>
     <w:qFormat/>
     <w:pPr>
-      <w:keepNext/>
-      <w:keepLines/>
       <w:jc w:val="center"/>
+      <w:spacing w:after="240"/>
     </w:pPr>
-  </w:style>
-  <w:style w:customStyle="1" w:styleId="Abstract" w:type="paragraph">
+    <w:rPr>
+      <w:rFonts w:ascii="Cambria" w:cs="Cambria" w:hAnsi="Cambria"/>
+      <w:i/>
+      <w:sz w:val="24"/>
+      <w:szCs w:val="24"/>
+    </w:rPr>
+  </w:style>
+  <w:style w:styleId="Abstract" w:type="paragraph">
     <w:name w:val="Abstract"/>
     <w:basedOn w:val="Normal"/>
-    <w:next w:val="BodyText"/>
     <w:qFormat/>
     <w:pPr>
-      <w:keepNext/>
-      <w:keepLines/>
-      <w:spacing w:after="300" w:before="300"/>
+      <w:jc w:val="both"/>
+      <w:ind w:left="720" w:right="720"/>
+      <w:spacing w:after="160"/>
     </w:pPr>
     <w:rPr>
+      <w:rFonts w:ascii="Cambria" w:cs="Cambria" w:hAnsi="Cambria"/>
       <w:sz w:val="20"/>
       <w:szCs w:val="20"/>
     </w:rPr>
@@ -3329,7 +3349,7 @@
     <w:qFormat/>
     <w:pPr>
       <w:jc w:val="both"/>
-      <w:spacing w:after="0" w:line="480" w:lineRule="auto"/>
+      <w:spacing w:after="0" w:line="360" w:lineRule="auto"/>
       <w:ind w:left="720" w:right="720"/>
     </w:pPr>
     <w:rPr>
@@ -3379,30 +3399,38 @@
     <w:basedOn w:val="Normal"/>
   </w:style>
   <w:style w:styleId="Caption" w:type="paragraph">
-    <w:name w:val="caption"/>
+    <w:name w:val="Caption"/>
     <w:basedOn w:val="Normal"/>
-    <w:link w:val="CaptionChar"/>
+    <w:qFormat/>
     <w:pPr>
-      <w:spacing w:after="120"/>
+      <w:jc w:val="center"/>
+      <w:spacing w:after="160" w:before="40"/>
     </w:pPr>
     <w:rPr>
+      <w:rFonts w:ascii="Cambria" w:cs="Cambria" w:hAnsi="Cambria"/>
       <w:i/>
-    </w:rPr>
-  </w:style>
-  <w:style w:customStyle="1" w:styleId="TableCaption" w:type="paragraph">
+      <w:sz w:val="18"/>
+      <w:szCs w:val="18"/>
+    </w:rPr>
+  </w:style>
+  <w:style w:styleId="TableCaption" w:type="paragraph">
     <w:name w:val="Table Caption"/>
     <w:basedOn w:val="Caption"/>
-    <w:pPr>
-      <w:keepNext/>
-    </w:pPr>
-  </w:style>
-  <w:style w:customStyle="1" w:styleId="ImageCaption" w:type="paragraph">
+    <w:qFormat/>
+  </w:style>
+  <w:style w:styleId="ImageCaption" w:type="paragraph">
     <w:name w:val="Image Caption"/>
     <w:basedOn w:val="Caption"/>
-  </w:style>
-  <w:style w:customStyle="1" w:styleId="Figure" w:type="paragraph">
+    <w:qFormat/>
+  </w:style>
+  <w:style w:styleId="Figure" w:type="paragraph">
     <w:name w:val="Figure"/>
     <w:basedOn w:val="Normal"/>
+    <w:qFormat/>
+    <w:pPr>
+      <w:jc w:val="center"/>
+      <w:spacing w:after="40" w:before="120"/>
+    </w:pPr>
   </w:style>
   <w:style w:customStyle="1" w:styleId="CaptionedFigure" w:type="paragraph">
     <w:name w:val="Captioned Figure"/>
@@ -3757,6 +3785,21 @@
     <w:basedOn w:val="DefaultParagraphFont"/>
     <w:link w:val="BodyText"/>
     <w:rsid w:val="00F9641B"/>
+  </w:style>
+  <w:style w:styleId="AbstractTitle" w:type="paragraph">
+    <w:name w:val="Abstract Title"/>
+    <w:basedOn w:val="Normal"/>
+    <w:qFormat/>
+    <w:pPr>
+      <w:jc w:val="center"/>
+      <w:spacing w:after="120" w:before="240"/>
+    </w:pPr>
+    <w:rPr>
+      <w:rFonts w:ascii="Cambria" w:cs="Cambria" w:hAnsi="Cambria"/>
+      <w:b/>
+      <w:sz w:val="24"/>
+      <w:szCs w:val="24"/>
+    </w:rPr>
   </w:style>
 </w:styles>
 </file>

</xml_diff>